<commit_message>
updated slides 01 - 04  wiht ## for slide and # for section and fixed boxes around output
</commit_message>
<xml_diff>
--- a/docs/content/multivariate_statistics/multivariate_statistics_lecture.docx
+++ b/docs/content/multivariate_statistics/multivariate_statistics_lecture.docx
@@ -18398,6 +18398,150 @@
         <w:rPr>
           <w:rStyle w:val="DocumentationTok"/>
         </w:rPr>
+        <w:t xml:space="preserve">##          Df SumOfSqs      R2      F Pr(&gt;F)   </w:t>
+      </w:r>
+      <w:r>
+        <w:br/>
+      </w:r>
+      <w:r>
+        <w:rPr>
+          <w:rStyle w:val="DocumentationTok"/>
+        </w:rPr>
+        <w:t xml:space="preserve">## Model     1   32.602 0.10636 5.7128  0.003 **</w:t>
+      </w:r>
+      <w:r>
+        <w:br/>
+      </w:r>
+      <w:r>
+        <w:rPr>
+          <w:rStyle w:val="DocumentationTok"/>
+        </w:rPr>
+        <w:t xml:space="preserve">## Residual 48  273.930 0.89364                 </w:t>
+      </w:r>
+      <w:r>
+        <w:br/>
+      </w:r>
+      <w:r>
+        <w:rPr>
+          <w:rStyle w:val="DocumentationTok"/>
+        </w:rPr>
+        <w:t xml:space="preserve">## Total    49  306.532 1.00000                 </w:t>
+      </w:r>
+      <w:r>
+        <w:br/>
+      </w:r>
+      <w:r>
+        <w:rPr>
+          <w:rStyle w:val="DocumentationTok"/>
+        </w:rPr>
+        <w:t xml:space="preserve">## ---</w:t>
+      </w:r>
+      <w:r>
+        <w:br/>
+      </w:r>
+      <w:r>
+        <w:rPr>
+          <w:rStyle w:val="DocumentationTok"/>
+        </w:rPr>
+        <w:t xml:space="preserve">## Signif. codes:  0 '***' 0.001 '**' 0.01 '*' 0.05 '.' 0.1 ' ' 1</w:t>
+      </w:r>
+      <w:r>
+        <w:br/>
+      </w:r>
+      <w:r>
+        <w:rPr>
+          <w:rStyle w:val="DocumentationTok"/>
+        </w:rPr>
+        <w:t xml:space="preserve">## </w:t>
+      </w:r>
+      <w:r>
+        <w:br/>
+      </w:r>
+      <w:r>
+        <w:rPr>
+          <w:rStyle w:val="DocumentationTok"/>
+        </w:rPr>
+        <w:t xml:space="preserve">## $TJH_vs_LEH</w:t>
+      </w:r>
+      <w:r>
+        <w:br/>
+      </w:r>
+      <w:r>
+        <w:rPr>
+          <w:rStyle w:val="DocumentationTok"/>
+        </w:rPr>
+        <w:t xml:space="preserve">##          Df SumOfSqs      R2      F Pr(&gt;F)   </w:t>
+      </w:r>
+      <w:r>
+        <w:br/>
+      </w:r>
+      <w:r>
+        <w:rPr>
+          <w:rStyle w:val="DocumentationTok"/>
+        </w:rPr>
+        <w:t xml:space="preserve">## Model     1    47.72 0.10517 5.6414  0.004 **</w:t>
+      </w:r>
+      <w:r>
+        <w:br/>
+      </w:r>
+      <w:r>
+        <w:rPr>
+          <w:rStyle w:val="DocumentationTok"/>
+        </w:rPr>
+        <w:t xml:space="preserve">## Residual 48   406.06 0.89483                 </w:t>
+      </w:r>
+      <w:r>
+        <w:br/>
+      </w:r>
+      <w:r>
+        <w:rPr>
+          <w:rStyle w:val="DocumentationTok"/>
+        </w:rPr>
+        <w:t xml:space="preserve">## Total    49   453.78 1.00000                 </w:t>
+      </w:r>
+      <w:r>
+        <w:br/>
+      </w:r>
+      <w:r>
+        <w:rPr>
+          <w:rStyle w:val="DocumentationTok"/>
+        </w:rPr>
+        <w:t xml:space="preserve">## ---</w:t>
+      </w:r>
+      <w:r>
+        <w:br/>
+      </w:r>
+      <w:r>
+        <w:rPr>
+          <w:rStyle w:val="DocumentationTok"/>
+        </w:rPr>
+        <w:t xml:space="preserve">## Signif. codes:  0 '***' 0.001 '**' 0.01 '*' 0.05 '.' 0.1 ' ' 1</w:t>
+      </w:r>
+      <w:r>
+        <w:br/>
+      </w:r>
+      <w:r>
+        <w:rPr>
+          <w:rStyle w:val="DocumentationTok"/>
+        </w:rPr>
+        <w:t xml:space="preserve">## </w:t>
+      </w:r>
+      <w:r>
+        <w:br/>
+      </w:r>
+      <w:r>
+        <w:rPr>
+          <w:rStyle w:val="DocumentationTok"/>
+        </w:rPr>
+        <w:t xml:space="preserve">## $TJH_vs_HD</w:t>
+      </w:r>
+      <w:r>
+        <w:br/>
+      </w:r>
+      <w:r>
+        <w:rPr>
+          <w:rStyle w:val="DocumentationTok"/>
+        </w:rPr>
         <w:t xml:space="preserve">##          Df SumOfSqs      R2      F Pr(&gt;F)    </w:t>
       </w:r>
       <w:r>
@@ -18407,7 +18551,7 @@
         <w:rPr>
           <w:rStyle w:val="DocumentationTok"/>
         </w:rPr>
-        <w:t xml:space="preserve">## Model     1   32.602 0.10636 5.7128  0.001 ***</w:t>
+        <w:t xml:space="preserve">## Model     1   69.308 0.25135 11.751  0.001 ***</w:t>
       </w:r>
       <w:r>
         <w:br/>
@@ -18416,7 +18560,7 @@
         <w:rPr>
           <w:rStyle w:val="DocumentationTok"/>
         </w:rPr>
-        <w:t xml:space="preserve">## Residual 48  273.930 0.89364                  </w:t>
+        <w:t xml:space="preserve">## Residual 35  206.432 0.74865                  </w:t>
       </w:r>
       <w:r>
         <w:br/>
@@ -18425,7 +18569,7 @@
         <w:rPr>
           <w:rStyle w:val="DocumentationTok"/>
         </w:rPr>
-        <w:t xml:space="preserve">## Total    49  306.532 1.00000                  </w:t>
+        <w:t xml:space="preserve">## Total    36  275.740 1.00000                  </w:t>
       </w:r>
       <w:r>
         <w:br/>
@@ -18461,7 +18605,7 @@
         <w:rPr>
           <w:rStyle w:val="DocumentationTok"/>
         </w:rPr>
-        <w:t xml:space="preserve">## $TJH_vs_LEH</w:t>
+        <w:t xml:space="preserve">## $DG_vs_LEH</w:t>
       </w:r>
       <w:r>
         <w:br/>
@@ -18470,7 +18614,7 @@
         <w:rPr>
           <w:rStyle w:val="DocumentationTok"/>
         </w:rPr>
-        <w:t xml:space="preserve">##          Df SumOfSqs      R2      F Pr(&gt;F)   </w:t>
+        <w:t xml:space="preserve">##          Df SumOfSqs      R2      F Pr(&gt;F)  </w:t>
       </w:r>
       <w:r>
         <w:br/>
@@ -18479,7 +18623,7 @@
         <w:rPr>
           <w:rStyle w:val="DocumentationTok"/>
         </w:rPr>
-        <w:t xml:space="preserve">## Model     1    47.72 0.10517 5.6414  0.006 **</w:t>
+        <w:t xml:space="preserve">## Model     1    26.24 0.06493 3.3333  0.017 *</w:t>
       </w:r>
       <w:r>
         <w:br/>
@@ -18488,7 +18632,7 @@
         <w:rPr>
           <w:rStyle w:val="DocumentationTok"/>
         </w:rPr>
-        <w:t xml:space="preserve">## Residual 48   406.06 0.89483                 </w:t>
+        <w:t xml:space="preserve">## Residual 48   377.85 0.93507                </w:t>
       </w:r>
       <w:r>
         <w:br/>
@@ -18497,7 +18641,7 @@
         <w:rPr>
           <w:rStyle w:val="DocumentationTok"/>
         </w:rPr>
-        <w:t xml:space="preserve">## Total    49   453.78 1.00000                 </w:t>
+        <w:t xml:space="preserve">## Total    49   404.09 1.00000                </w:t>
       </w:r>
       <w:r>
         <w:br/>
@@ -18533,7 +18677,7 @@
         <w:rPr>
           <w:rStyle w:val="DocumentationTok"/>
         </w:rPr>
-        <w:t xml:space="preserve">## $TJH_vs_HD</w:t>
+        <w:t xml:space="preserve">## $DG_vs_HD</w:t>
       </w:r>
       <w:r>
         <w:br/>
@@ -18551,7 +18695,7 @@
         <w:rPr>
           <w:rStyle w:val="DocumentationTok"/>
         </w:rPr>
-        <w:t xml:space="preserve">## Model     1   69.308 0.25135 11.751  0.001 ***</w:t>
+        <w:t xml:space="preserve">## Model     1   131.09 0.42382 25.745  0.001 ***</w:t>
       </w:r>
       <w:r>
         <w:br/>
@@ -18560,7 +18704,7 @@
         <w:rPr>
           <w:rStyle w:val="DocumentationTok"/>
         </w:rPr>
-        <w:t xml:space="preserve">## Residual 35  206.432 0.74865                  </w:t>
+        <w:t xml:space="preserve">## Residual 35   178.22 0.57618                  </w:t>
       </w:r>
       <w:r>
         <w:br/>
@@ -18569,7 +18713,7 @@
         <w:rPr>
           <w:rStyle w:val="DocumentationTok"/>
         </w:rPr>
-        <w:t xml:space="preserve">## Total    36  275.740 1.00000                  </w:t>
+        <w:t xml:space="preserve">## Total    36   309.31 1.00000                  </w:t>
       </w:r>
       <w:r>
         <w:br/>
@@ -18605,7 +18749,7 @@
         <w:rPr>
           <w:rStyle w:val="DocumentationTok"/>
         </w:rPr>
-        <w:t xml:space="preserve">## $DG_vs_LEH</w:t>
+        <w:t xml:space="preserve">## $LEH_vs_HD</w:t>
       </w:r>
       <w:r>
         <w:br/>
@@ -18614,7 +18758,7 @@
         <w:rPr>
           <w:rStyle w:val="DocumentationTok"/>
         </w:rPr>
-        <w:t xml:space="preserve">##          Df SumOfSqs      R2      F Pr(&gt;F)  </w:t>
+        <w:t xml:space="preserve">##          Df SumOfSqs     R2      F Pr(&gt;F)    </w:t>
       </w:r>
       <w:r>
         <w:br/>
@@ -18623,7 +18767,7 @@
         <w:rPr>
           <w:rStyle w:val="DocumentationTok"/>
         </w:rPr>
-        <w:t xml:space="preserve">## Model     1    26.24 0.06493 3.3333  0.022 *</w:t>
+        <w:t xml:space="preserve">## Model     1   101.69 0.2468 11.468  0.001 ***</w:t>
       </w:r>
       <w:r>
         <w:br/>
@@ -18632,7 +18776,7 @@
         <w:rPr>
           <w:rStyle w:val="DocumentationTok"/>
         </w:rPr>
-        <w:t xml:space="preserve">## Residual 48   377.85 0.93507                </w:t>
+        <w:t xml:space="preserve">## Residual 35   310.35 0.7532                  </w:t>
       </w:r>
       <w:r>
         <w:br/>
@@ -18641,7 +18785,7 @@
         <w:rPr>
           <w:rStyle w:val="DocumentationTok"/>
         </w:rPr>
-        <w:t xml:space="preserve">## Total    49   404.09 1.00000                </w:t>
+        <w:t xml:space="preserve">## Total    36   412.04 1.0000                  </w:t>
       </w:r>
       <w:r>
         <w:br/>
@@ -18677,7 +18821,7 @@
         <w:rPr>
           <w:rStyle w:val="DocumentationTok"/>
         </w:rPr>
-        <w:t xml:space="preserve">## $DG_vs_HD</w:t>
+        <w:t xml:space="preserve">## attr(,"class")</w:t>
       </w:r>
       <w:r>
         <w:br/>
@@ -18686,7 +18830,216 @@
         <w:rPr>
           <w:rStyle w:val="DocumentationTok"/>
         </w:rPr>
-        <w:t xml:space="preserve">##          Df SumOfSqs      R2      F Pr(&gt;F)    </w:t>
+        <w:t xml:space="preserve">## [1] "pwadstrata" "list"</w:t>
+      </w:r>
+    </w:p>
+    <w:p>
+      <w:pPr>
+        <w:pStyle w:val="SourceCode"/>
+      </w:pPr>
+      <w:r>
+        <w:rPr>
+          <w:rStyle w:val="CommentTok"/>
+        </w:rPr>
+        <w:t xml:space="preserve"># install.packages("RVAideMemoire")</w:t>
+      </w:r>
+      <w:r>
+        <w:br/>
+      </w:r>
+      <w:r>
+        <w:rPr>
+          <w:rStyle w:val="FunctionTok"/>
+        </w:rPr>
+        <w:t xml:space="preserve">library</w:t>
+      </w:r>
+      <w:r>
+        <w:rPr>
+          <w:rStyle w:val="NormalTok"/>
+        </w:rPr>
+        <w:t xml:space="preserve">(RVAideMemoire)</w:t>
+      </w:r>
+      <w:r>
+        <w:br/>
+      </w:r>
+      <w:r>
+        <w:br/>
+      </w:r>
+      <w:r>
+        <w:rPr>
+          <w:rStyle w:val="CommentTok"/>
+        </w:rPr>
+        <w:t xml:space="preserve"># Pairwise PERMANOVA</w:t>
+      </w:r>
+      <w:r>
+        <w:br/>
+      </w:r>
+      <w:r>
+        <w:rPr>
+          <w:rStyle w:val="FunctionTok"/>
+        </w:rPr>
+        <w:t xml:space="preserve">pairwise.perm.manova</w:t>
+      </w:r>
+      <w:r>
+        <w:rPr>
+          <w:rStyle w:val="NormalTok"/>
+        </w:rPr>
+        <w:t xml:space="preserve">(</w:t>
+      </w:r>
+      <w:r>
+        <w:rPr>
+          <w:rStyle w:val="FunctionTok"/>
+        </w:rPr>
+        <w:t xml:space="preserve">vegdist</w:t>
+      </w:r>
+      <w:r>
+        <w:rPr>
+          <w:rStyle w:val="NormalTok"/>
+        </w:rPr>
+        <w:t xml:space="preserve">(darl_scaled, </w:t>
+      </w:r>
+      <w:r>
+        <w:rPr>
+          <w:rStyle w:val="AttributeTok"/>
+        </w:rPr>
+        <w:t xml:space="preserve">method =</w:t>
+      </w:r>
+      <w:r>
+        <w:rPr>
+          <w:rStyle w:val="NormalTok"/>
+        </w:rPr>
+        <w:t xml:space="preserve"> </w:t>
+      </w:r>
+      <w:r>
+        <w:rPr>
+          <w:rStyle w:val="StringTok"/>
+        </w:rPr>
+        <w:t xml:space="preserve">"euclidean"</w:t>
+      </w:r>
+      <w:r>
+        <w:rPr>
+          <w:rStyle w:val="NormalTok"/>
+        </w:rPr>
+        <w:t xml:space="preserve">),</w:t>
+      </w:r>
+      <w:r>
+        <w:br/>
+      </w:r>
+      <w:r>
+        <w:rPr>
+          <w:rStyle w:val="NormalTok"/>
+        </w:rPr>
+        <w:t xml:space="preserve">                     darlingtonia</w:t>
+      </w:r>
+      <w:r>
+        <w:rPr>
+          <w:rStyle w:val="SpecialCharTok"/>
+        </w:rPr>
+        <w:t xml:space="preserve">$</w:t>
+      </w:r>
+      <w:r>
+        <w:rPr>
+          <w:rStyle w:val="NormalTok"/>
+        </w:rPr>
+        <w:t xml:space="preserve">site,</w:t>
+      </w:r>
+      <w:r>
+        <w:br/>
+      </w:r>
+      <w:r>
+        <w:rPr>
+          <w:rStyle w:val="NormalTok"/>
+        </w:rPr>
+        <w:t xml:space="preserve">                     </w:t>
+      </w:r>
+      <w:r>
+        <w:rPr>
+          <w:rStyle w:val="AttributeTok"/>
+        </w:rPr>
+        <w:t xml:space="preserve">test =</w:t>
+      </w:r>
+      <w:r>
+        <w:rPr>
+          <w:rStyle w:val="NormalTok"/>
+        </w:rPr>
+        <w:t xml:space="preserve"> </w:t>
+      </w:r>
+      <w:r>
+        <w:rPr>
+          <w:rStyle w:val="StringTok"/>
+        </w:rPr>
+        <w:t xml:space="preserve">"Wilks"</w:t>
+      </w:r>
+      <w:r>
+        <w:rPr>
+          <w:rStyle w:val="NormalTok"/>
+        </w:rPr>
+        <w:t xml:space="preserve">,</w:t>
+      </w:r>
+      <w:r>
+        <w:br/>
+      </w:r>
+      <w:r>
+        <w:rPr>
+          <w:rStyle w:val="NormalTok"/>
+        </w:rPr>
+        <w:t xml:space="preserve">                     </w:t>
+      </w:r>
+      <w:r>
+        <w:rPr>
+          <w:rStyle w:val="AttributeTok"/>
+        </w:rPr>
+        <w:t xml:space="preserve">nperm =</w:t>
+      </w:r>
+      <w:r>
+        <w:rPr>
+          <w:rStyle w:val="NormalTok"/>
+        </w:rPr>
+        <w:t xml:space="preserve"> </w:t>
+      </w:r>
+      <w:r>
+        <w:rPr>
+          <w:rStyle w:val="DecValTok"/>
+        </w:rPr>
+        <w:t xml:space="preserve">999</w:t>
+      </w:r>
+      <w:r>
+        <w:rPr>
+          <w:rStyle w:val="NormalTok"/>
+        </w:rPr>
+        <w:t xml:space="preserve">,</w:t>
+      </w:r>
+      <w:r>
+        <w:br/>
+      </w:r>
+      <w:r>
+        <w:rPr>
+          <w:rStyle w:val="NormalTok"/>
+        </w:rPr>
+        <w:t xml:space="preserve">                     </w:t>
+      </w:r>
+      <w:r>
+        <w:rPr>
+          <w:rStyle w:val="AttributeTok"/>
+        </w:rPr>
+        <w:t xml:space="preserve">p.method =</w:t>
+      </w:r>
+      <w:r>
+        <w:rPr>
+          <w:rStyle w:val="NormalTok"/>
+        </w:rPr>
+        <w:t xml:space="preserve"> </w:t>
+      </w:r>
+      <w:r>
+        <w:rPr>
+          <w:rStyle w:val="StringTok"/>
+        </w:rPr>
+        <w:t xml:space="preserve">"bonferroni"</w:t>
+      </w:r>
+      <w:r>
+        <w:rPr>
+          <w:rStyle w:val="NormalTok"/>
+        </w:rPr>
+        <w:t xml:space="preserve">)</w:t>
       </w:r>
       <w:r>
         <w:br/>
@@ -18695,7 +19048,7 @@
         <w:rPr>
           <w:rStyle w:val="DocumentationTok"/>
         </w:rPr>
-        <w:t xml:space="preserve">## Model     1   131.09 0.42382 25.745  0.001 ***</w:t>
+        <w:t xml:space="preserve">## </w:t>
       </w:r>
       <w:r>
         <w:br/>
@@ -18704,7 +19057,7 @@
         <w:rPr>
           <w:rStyle w:val="DocumentationTok"/>
         </w:rPr>
-        <w:t xml:space="preserve">## Residual 35   178.22 0.57618                  </w:t>
+        <w:t xml:space="preserve">##  Pairwise comparisons using permutation MANOVAs on a distance matrix </w:t>
       </w:r>
       <w:r>
         <w:br/>
@@ -18713,7 +19066,7 @@
         <w:rPr>
           <w:rStyle w:val="DocumentationTok"/>
         </w:rPr>
-        <w:t xml:space="preserve">## Total    36   309.31 1.00000                  </w:t>
+        <w:t xml:space="preserve">## </w:t>
       </w:r>
       <w:r>
         <w:br/>
@@ -18722,7 +19075,7 @@
         <w:rPr>
           <w:rStyle w:val="DocumentationTok"/>
         </w:rPr>
-        <w:t xml:space="preserve">## ---</w:t>
+        <w:t xml:space="preserve">## data:  vegdist(darl_scaled, method = "euclidean") by darlingtonia$site</w:t>
       </w:r>
       <w:r>
         <w:br/>
@@ -18731,7 +19084,7 @@
         <w:rPr>
           <w:rStyle w:val="DocumentationTok"/>
         </w:rPr>
-        <w:t xml:space="preserve">## Signif. codes:  0 '***' 0.001 '**' 0.01 '*' 0.05 '.' 0.1 ' ' 1</w:t>
+        <w:t xml:space="preserve">## 999 permutations </w:t>
       </w:r>
       <w:r>
         <w:br/>
@@ -18749,7 +19102,7 @@
         <w:rPr>
           <w:rStyle w:val="DocumentationTok"/>
         </w:rPr>
-        <w:t xml:space="preserve">## $LEH_vs_HD</w:t>
+        <w:t xml:space="preserve">##     DG    HD    LEH  </w:t>
       </w:r>
       <w:r>
         <w:br/>
@@ -18758,7 +19111,7 @@
         <w:rPr>
           <w:rStyle w:val="DocumentationTok"/>
         </w:rPr>
-        <w:t xml:space="preserve">##          Df SumOfSqs     R2      F Pr(&gt;F)    </w:t>
+        <w:t xml:space="preserve">## HD  0.006 -     -    </w:t>
       </w:r>
       <w:r>
         <w:br/>
@@ -18767,7 +19120,7 @@
         <w:rPr>
           <w:rStyle w:val="DocumentationTok"/>
         </w:rPr>
-        <w:t xml:space="preserve">## Model     1   101.69 0.2468 11.468  0.001 ***</w:t>
+        <w:t xml:space="preserve">## LEH 0.138 0.006 -    </w:t>
       </w:r>
       <w:r>
         <w:br/>
@@ -18776,360 +19129,7 @@
         <w:rPr>
           <w:rStyle w:val="DocumentationTok"/>
         </w:rPr>
-        <w:t xml:space="preserve">## Residual 35   310.35 0.7532                  </w:t>
-      </w:r>
-      <w:r>
-        <w:br/>
-      </w:r>
-      <w:r>
-        <w:rPr>
-          <w:rStyle w:val="DocumentationTok"/>
-        </w:rPr>
-        <w:t xml:space="preserve">## Total    36   412.04 1.0000                  </w:t>
-      </w:r>
-      <w:r>
-        <w:br/>
-      </w:r>
-      <w:r>
-        <w:rPr>
-          <w:rStyle w:val="DocumentationTok"/>
-        </w:rPr>
-        <w:t xml:space="preserve">## ---</w:t>
-      </w:r>
-      <w:r>
-        <w:br/>
-      </w:r>
-      <w:r>
-        <w:rPr>
-          <w:rStyle w:val="DocumentationTok"/>
-        </w:rPr>
-        <w:t xml:space="preserve">## Signif. codes:  0 '***' 0.001 '**' 0.01 '*' 0.05 '.' 0.1 ' ' 1</w:t>
-      </w:r>
-      <w:r>
-        <w:br/>
-      </w:r>
-      <w:r>
-        <w:rPr>
-          <w:rStyle w:val="DocumentationTok"/>
-        </w:rPr>
-        <w:t xml:space="preserve">## </w:t>
-      </w:r>
-      <w:r>
-        <w:br/>
-      </w:r>
-      <w:r>
-        <w:rPr>
-          <w:rStyle w:val="DocumentationTok"/>
-        </w:rPr>
-        <w:t xml:space="preserve">## attr(,"class")</w:t>
-      </w:r>
-      <w:r>
-        <w:br/>
-      </w:r>
-      <w:r>
-        <w:rPr>
-          <w:rStyle w:val="DocumentationTok"/>
-        </w:rPr>
-        <w:t xml:space="preserve">## [1] "pwadstrata" "list"</w:t>
-      </w:r>
-    </w:p>
-    <w:p>
-      <w:pPr>
-        <w:pStyle w:val="SourceCode"/>
-      </w:pPr>
-      <w:r>
-        <w:rPr>
-          <w:rStyle w:val="CommentTok"/>
-        </w:rPr>
-        <w:t xml:space="preserve"># install.packages("RVAideMemoire")</w:t>
-      </w:r>
-      <w:r>
-        <w:br/>
-      </w:r>
-      <w:r>
-        <w:rPr>
-          <w:rStyle w:val="FunctionTok"/>
-        </w:rPr>
-        <w:t xml:space="preserve">library</w:t>
-      </w:r>
-      <w:r>
-        <w:rPr>
-          <w:rStyle w:val="NormalTok"/>
-        </w:rPr>
-        <w:t xml:space="preserve">(RVAideMemoire)</w:t>
-      </w:r>
-      <w:r>
-        <w:br/>
-      </w:r>
-      <w:r>
-        <w:br/>
-      </w:r>
-      <w:r>
-        <w:rPr>
-          <w:rStyle w:val="CommentTok"/>
-        </w:rPr>
-        <w:t xml:space="preserve"># Pairwise PERMANOVA</w:t>
-      </w:r>
-      <w:r>
-        <w:br/>
-      </w:r>
-      <w:r>
-        <w:rPr>
-          <w:rStyle w:val="FunctionTok"/>
-        </w:rPr>
-        <w:t xml:space="preserve">pairwise.perm.manova</w:t>
-      </w:r>
-      <w:r>
-        <w:rPr>
-          <w:rStyle w:val="NormalTok"/>
-        </w:rPr>
-        <w:t xml:space="preserve">(</w:t>
-      </w:r>
-      <w:r>
-        <w:rPr>
-          <w:rStyle w:val="FunctionTok"/>
-        </w:rPr>
-        <w:t xml:space="preserve">vegdist</w:t>
-      </w:r>
-      <w:r>
-        <w:rPr>
-          <w:rStyle w:val="NormalTok"/>
-        </w:rPr>
-        <w:t xml:space="preserve">(darl_scaled, </w:t>
-      </w:r>
-      <w:r>
-        <w:rPr>
-          <w:rStyle w:val="AttributeTok"/>
-        </w:rPr>
-        <w:t xml:space="preserve">method =</w:t>
-      </w:r>
-      <w:r>
-        <w:rPr>
-          <w:rStyle w:val="NormalTok"/>
-        </w:rPr>
-        <w:t xml:space="preserve"> </w:t>
-      </w:r>
-      <w:r>
-        <w:rPr>
-          <w:rStyle w:val="StringTok"/>
-        </w:rPr>
-        <w:t xml:space="preserve">"euclidean"</w:t>
-      </w:r>
-      <w:r>
-        <w:rPr>
-          <w:rStyle w:val="NormalTok"/>
-        </w:rPr>
-        <w:t xml:space="preserve">),</w:t>
-      </w:r>
-      <w:r>
-        <w:br/>
-      </w:r>
-      <w:r>
-        <w:rPr>
-          <w:rStyle w:val="NormalTok"/>
-        </w:rPr>
-        <w:t xml:space="preserve">                     darlingtonia</w:t>
-      </w:r>
-      <w:r>
-        <w:rPr>
-          <w:rStyle w:val="SpecialCharTok"/>
-        </w:rPr>
-        <w:t xml:space="preserve">$</w:t>
-      </w:r>
-      <w:r>
-        <w:rPr>
-          <w:rStyle w:val="NormalTok"/>
-        </w:rPr>
-        <w:t xml:space="preserve">site,</w:t>
-      </w:r>
-      <w:r>
-        <w:br/>
-      </w:r>
-      <w:r>
-        <w:rPr>
-          <w:rStyle w:val="NormalTok"/>
-        </w:rPr>
-        <w:t xml:space="preserve">                     </w:t>
-      </w:r>
-      <w:r>
-        <w:rPr>
-          <w:rStyle w:val="AttributeTok"/>
-        </w:rPr>
-        <w:t xml:space="preserve">test =</w:t>
-      </w:r>
-      <w:r>
-        <w:rPr>
-          <w:rStyle w:val="NormalTok"/>
-        </w:rPr>
-        <w:t xml:space="preserve"> </w:t>
-      </w:r>
-      <w:r>
-        <w:rPr>
-          <w:rStyle w:val="StringTok"/>
-        </w:rPr>
-        <w:t xml:space="preserve">"Wilks"</w:t>
-      </w:r>
-      <w:r>
-        <w:rPr>
-          <w:rStyle w:val="NormalTok"/>
-        </w:rPr>
-        <w:t xml:space="preserve">,</w:t>
-      </w:r>
-      <w:r>
-        <w:br/>
-      </w:r>
-      <w:r>
-        <w:rPr>
-          <w:rStyle w:val="NormalTok"/>
-        </w:rPr>
-        <w:t xml:space="preserve">                     </w:t>
-      </w:r>
-      <w:r>
-        <w:rPr>
-          <w:rStyle w:val="AttributeTok"/>
-        </w:rPr>
-        <w:t xml:space="preserve">nperm =</w:t>
-      </w:r>
-      <w:r>
-        <w:rPr>
-          <w:rStyle w:val="NormalTok"/>
-        </w:rPr>
-        <w:t xml:space="preserve"> </w:t>
-      </w:r>
-      <w:r>
-        <w:rPr>
-          <w:rStyle w:val="DecValTok"/>
-        </w:rPr>
-        <w:t xml:space="preserve">999</w:t>
-      </w:r>
-      <w:r>
-        <w:rPr>
-          <w:rStyle w:val="NormalTok"/>
-        </w:rPr>
-        <w:t xml:space="preserve">,</w:t>
-      </w:r>
-      <w:r>
-        <w:br/>
-      </w:r>
-      <w:r>
-        <w:rPr>
-          <w:rStyle w:val="NormalTok"/>
-        </w:rPr>
-        <w:t xml:space="preserve">                     </w:t>
-      </w:r>
-      <w:r>
-        <w:rPr>
-          <w:rStyle w:val="AttributeTok"/>
-        </w:rPr>
-        <w:t xml:space="preserve">p.method =</w:t>
-      </w:r>
-      <w:r>
-        <w:rPr>
-          <w:rStyle w:val="NormalTok"/>
-        </w:rPr>
-        <w:t xml:space="preserve"> </w:t>
-      </w:r>
-      <w:r>
-        <w:rPr>
-          <w:rStyle w:val="StringTok"/>
-        </w:rPr>
-        <w:t xml:space="preserve">"bonferroni"</w:t>
-      </w:r>
-      <w:r>
-        <w:rPr>
-          <w:rStyle w:val="NormalTok"/>
-        </w:rPr>
-        <w:t xml:space="preserve">)</w:t>
-      </w:r>
-      <w:r>
-        <w:br/>
-      </w:r>
-      <w:r>
-        <w:rPr>
-          <w:rStyle w:val="DocumentationTok"/>
-        </w:rPr>
-        <w:t xml:space="preserve">## </w:t>
-      </w:r>
-      <w:r>
-        <w:br/>
-      </w:r>
-      <w:r>
-        <w:rPr>
-          <w:rStyle w:val="DocumentationTok"/>
-        </w:rPr>
-        <w:t xml:space="preserve">##  Pairwise comparisons using permutation MANOVAs on a distance matrix </w:t>
-      </w:r>
-      <w:r>
-        <w:br/>
-      </w:r>
-      <w:r>
-        <w:rPr>
-          <w:rStyle w:val="DocumentationTok"/>
-        </w:rPr>
-        <w:t xml:space="preserve">## </w:t>
-      </w:r>
-      <w:r>
-        <w:br/>
-      </w:r>
-      <w:r>
-        <w:rPr>
-          <w:rStyle w:val="DocumentationTok"/>
-        </w:rPr>
-        <w:t xml:space="preserve">## data:  vegdist(darl_scaled, method = "euclidean") by darlingtonia$site</w:t>
-      </w:r>
-      <w:r>
-        <w:br/>
-      </w:r>
-      <w:r>
-        <w:rPr>
-          <w:rStyle w:val="DocumentationTok"/>
-        </w:rPr>
-        <w:t xml:space="preserve">## 999 permutations </w:t>
-      </w:r>
-      <w:r>
-        <w:br/>
-      </w:r>
-      <w:r>
-        <w:rPr>
-          <w:rStyle w:val="DocumentationTok"/>
-        </w:rPr>
-        <w:t xml:space="preserve">## </w:t>
-      </w:r>
-      <w:r>
-        <w:br/>
-      </w:r>
-      <w:r>
-        <w:rPr>
-          <w:rStyle w:val="DocumentationTok"/>
-        </w:rPr>
-        <w:t xml:space="preserve">##     DG    HD    LEH  </w:t>
-      </w:r>
-      <w:r>
-        <w:br/>
-      </w:r>
-      <w:r>
-        <w:rPr>
-          <w:rStyle w:val="DocumentationTok"/>
-        </w:rPr>
-        <w:t xml:space="preserve">## HD  0.006 -     -    </w:t>
-      </w:r>
-      <w:r>
-        <w:br/>
-      </w:r>
-      <w:r>
-        <w:rPr>
-          <w:rStyle w:val="DocumentationTok"/>
-        </w:rPr>
-        <w:t xml:space="preserve">## LEH 0.096 0.006 -    </w:t>
-      </w:r>
-      <w:r>
-        <w:br/>
-      </w:r>
-      <w:r>
-        <w:rPr>
-          <w:rStyle w:val="DocumentationTok"/>
-        </w:rPr>
-        <w:t xml:space="preserve">## TJH 0.030 0.006 0.012</w:t>
+        <w:t xml:space="preserve">## TJH 0.012 0.006 0.006</w:t>
       </w:r>
       <w:r>
         <w:br/>

</xml_diff>